<commit_message>
Add narrated Day 01 animation and document the study course in the README
- Re-time the animation to English voice-over (per-scene clips), add subtitles
  (.srt + embedded track), keep a silent copy; narration script and clips included
- Update Day 01 tutorial text for the new animation
- README: describe the study course, setup, per-day contents, progress table,
  two-Pi workflow, screenshot slots, rebuild instructions, credits

Co-Authored-By: Claude Sonnet 5.5 <noreply@anthropic.com>
Claude-Session: https://claude.ai/code/session_01TKpiyDgkRVMDW5GqKtQ3Pe
</commit_message>
<xml_diff>
--- a/tutorials/day01/Day01_Meet_Your_Raspberry_Pi.docx
+++ b/tutorials/day01/Day01_Meet_Your_Raspberry_Pi.docx
@@ -3771,7 +3771,7 @@
           <w:color w:val="1F2933"/>
           <w:sz w:val="18"/>
         </w:rPr>
-        <w:t>Key frames of the animation 'Day01_flash_boot_ssh.mp4' (27 s): write the card, insert it, power on and first boot, join Wi-Fi, SSH from the laptop. Play the video file for the full story.</w:t>
+        <w:t>Key frames of the narrated animation 'Day01_flash_boot_ssh.mp4' (about 70 s, English voice-over + subtitles): write the card, insert it, power on and first boot, join Wi-Fi, SSH from the laptop. Play the video file for the full story.</w:t>
       </w:r>
     </w:p>
     <w:p>
@@ -6416,7 +6416,7 @@
               <w:rPr>
                 <w:sz w:val="20"/>
               </w:rPr>
-              <w:t>Play the animation (tutorials/day01/animations) or read Part E ahead of time.</w:t>
+              <w:t>Watch the narrated animation (tutorials/day01/animations) or read Part E ahead of time.</w:t>
             </w:r>
           </w:p>
         </w:tc>
@@ -11305,7 +11305,7 @@
               <w:rPr>
                 <w:sz w:val="17"/>
               </w:rPr>
-              <w:t>tutorials/day01/animations/Day01_flash_boot_ssh.mp4 (and .gif)</w:t>
+              <w:t>tutorials/day01/animations/Day01_flash_boot_ssh.mp4 (silent copy and .gif also there)</w:t>
             </w:r>
           </w:p>
         </w:tc>
@@ -11336,7 +11336,7 @@
               <w:rPr>
                 <w:sz w:val="17"/>
               </w:rPr>
-              <w:t>27 seconds: write the card, boot, Wi-Fi, SSH.</w:t>
+              <w:t>About 70 s with English narration and subtitles (script in animations/narration/): write the card, boot, Wi-Fi, SSH.</w:t>
             </w:r>
           </w:p>
         </w:tc>

</xml_diff>

<commit_message>
Cover both Raspberry Pi 4 and Pi 5 in the Day 01 tutorials
Add a Pi 4 vs Pi 5 comparison and Pi 4 / Pi 5 markers where steps differ
(Imager device, power supply and button, restart after shutdown, cooling,
camera ports, OS) to the standard tutorial and both handwritten editions.
README documents the convention for all days.

Co-Authored-By: Claude Sonnet 5.5 <noreply@anthropic.com>
Claude-Session: https://claude.ai/code/session_01TKpiyDgkRVMDW5GqKtQ3Pe
</commit_message>
<xml_diff>
--- a/tutorials/day01/Day01_Meet_Your_Raspberry_Pi.docx
+++ b/tutorials/day01/Day01_Meet_Your_Raspberry_Pi.docx
@@ -3325,6 +3325,1676 @@
     </w:p>
     <w:p>
       <w:pPr>
+        <w:pStyle w:val="Heading2"/>
+      </w:pPr>
+      <w:r>
+        <w:t>B3. Your Pi 4 and the book's Pi 5, side by side</w:t>
+      </w:r>
+    </w:p>
+    <w:p>
+      <w:pPr>
+        <w:keepNext w:val="0"/>
+        <w:keepLines w:val="0"/>
+        <w:spacing w:before="0" w:after="80" w:line="269" w:lineRule="auto"/>
+      </w:pPr>
+      <w:r>
+        <w:rPr>
+          <w:sz w:val="20"/>
+        </w:rPr>
+        <w:t xml:space="preserve">The book is written around the </w:t>
+      </w:r>
+      <w:r>
+        <w:rPr>
+          <w:b/>
+          <w:sz w:val="20"/>
+        </w:rPr>
+        <w:t>Raspberry Pi 5</w:t>
+      </w:r>
+      <w:r>
+        <w:rPr>
+          <w:sz w:val="20"/>
+        </w:rPr>
+        <w:t xml:space="preserve">; you own a </w:t>
+      </w:r>
+      <w:r>
+        <w:rPr>
+          <w:b/>
+          <w:sz w:val="20"/>
+        </w:rPr>
+        <w:t>Raspberry Pi 4</w:t>
+      </w:r>
+      <w:r>
+        <w:rPr>
+          <w:sz w:val="20"/>
+        </w:rPr>
+        <w:t xml:space="preserve">; your students may have either. Every step in this tutorial works on both boards. Where they differ, the text says </w:t>
+      </w:r>
+      <w:r>
+        <w:rPr>
+          <w:b/>
+          <w:sz w:val="20"/>
+        </w:rPr>
+        <w:t>Pi 4</w:t>
+      </w:r>
+      <w:r>
+        <w:rPr>
+          <w:sz w:val="20"/>
+        </w:rPr>
+        <w:t xml:space="preserve"> or </w:t>
+      </w:r>
+      <w:r>
+        <w:rPr>
+          <w:b/>
+          <w:sz w:val="20"/>
+        </w:rPr>
+        <w:t>Pi 5</w:t>
+      </w:r>
+      <w:r>
+        <w:rPr>
+          <w:sz w:val="20"/>
+        </w:rPr>
+        <w:t>, and this table is the quick reference.</w:t>
+      </w:r>
+    </w:p>
+    <w:tbl>
+      <w:tblPr>
+        <w:tblW w:type="auto" w:w="0"/>
+        <w:jc w:val="center"/>
+        <w:tblLayout w:type="fixed"/>
+        <w:tblLook w:firstColumn="1" w:firstRow="1" w:lastColumn="0" w:lastRow="0" w:noHBand="0" w:noVBand="1" w:val="04A0"/>
+        <w:tblLayout w:type="fixed"/>
+      </w:tblPr>
+      <w:tblGrid>
+        <w:gridCol w:w="1474"/>
+        <w:gridCol w:w="2211"/>
+        <w:gridCol w:w="2551"/>
+        <w:gridCol w:w="3514"/>
+      </w:tblGrid>
+      <w:tr>
+        <w:trPr>
+          <w:tblHeader/>
+        </w:trPr>
+        <w:tc>
+          <w:tcPr>
+            <w:tcW w:type="dxa" w:w="1474"/>
+            <w:shd w:val="clear" w:color="auto" w:fill="1F3A5F"/>
+            <w:tcMar>
+              <w:top w:w="60" w:type="dxa"/>
+              <w:left w:w="100" w:type="dxa"/>
+              <w:bottom w:w="60" w:type="dxa"/>
+              <w:right w:w="100" w:type="dxa"/>
+            </w:tcMar>
+            <w:tcBorders>
+              <w:top w:val="nil"/>
+              <w:left w:val="nil"/>
+              <w:bottom w:val="nil"/>
+              <w:right w:val="nil"/>
+            </w:tcBorders>
+          </w:tcPr>
+          <w:p>
+            <w:pPr>
+              <w:keepNext w:val="0"/>
+              <w:keepLines w:val="0"/>
+              <w:spacing w:before="0" w:after="0" w:line="269" w:lineRule="auto"/>
+            </w:pPr>
+            <w:r>
+              <w:rPr>
+                <w:b/>
+                <w:color w:val="FFFFFF"/>
+                <w:sz w:val="17"/>
+              </w:rPr>
+              <w:t>Topic</w:t>
+            </w:r>
+          </w:p>
+        </w:tc>
+        <w:tc>
+          <w:tcPr>
+            <w:tcW w:type="dxa" w:w="2211"/>
+            <w:shd w:val="clear" w:color="auto" w:fill="1F3A5F"/>
+            <w:tcMar>
+              <w:top w:w="60" w:type="dxa"/>
+              <w:left w:w="100" w:type="dxa"/>
+              <w:bottom w:w="60" w:type="dxa"/>
+              <w:right w:w="100" w:type="dxa"/>
+            </w:tcMar>
+            <w:tcBorders>
+              <w:top w:val="nil"/>
+              <w:left w:val="nil"/>
+              <w:bottom w:val="nil"/>
+              <w:right w:val="nil"/>
+            </w:tcBorders>
+          </w:tcPr>
+          <w:p>
+            <w:pPr>
+              <w:keepNext w:val="0"/>
+              <w:keepLines w:val="0"/>
+              <w:spacing w:before="0" w:after="0" w:line="269" w:lineRule="auto"/>
+            </w:pPr>
+            <w:r>
+              <w:rPr>
+                <w:b/>
+                <w:color w:val="FFFFFF"/>
+                <w:sz w:val="17"/>
+              </w:rPr>
+              <w:t>Pi 4 (yours)</w:t>
+            </w:r>
+          </w:p>
+        </w:tc>
+        <w:tc>
+          <w:tcPr>
+            <w:tcW w:type="dxa" w:w="2551"/>
+            <w:shd w:val="clear" w:color="auto" w:fill="1F3A5F"/>
+            <w:tcMar>
+              <w:top w:w="60" w:type="dxa"/>
+              <w:left w:w="100" w:type="dxa"/>
+              <w:bottom w:w="60" w:type="dxa"/>
+              <w:right w:w="100" w:type="dxa"/>
+            </w:tcMar>
+            <w:tcBorders>
+              <w:top w:val="nil"/>
+              <w:left w:val="nil"/>
+              <w:bottom w:val="nil"/>
+              <w:right w:val="nil"/>
+            </w:tcBorders>
+          </w:tcPr>
+          <w:p>
+            <w:pPr>
+              <w:keepNext w:val="0"/>
+              <w:keepLines w:val="0"/>
+              <w:spacing w:before="0" w:after="0" w:line="269" w:lineRule="auto"/>
+            </w:pPr>
+            <w:r>
+              <w:rPr>
+                <w:b/>
+                <w:color w:val="FFFFFF"/>
+                <w:sz w:val="17"/>
+              </w:rPr>
+              <w:t>Pi 5</w:t>
+            </w:r>
+          </w:p>
+        </w:tc>
+        <w:tc>
+          <w:tcPr>
+            <w:tcW w:type="dxa" w:w="3515"/>
+            <w:shd w:val="clear" w:color="auto" w:fill="1F3A5F"/>
+            <w:tcMar>
+              <w:top w:w="60" w:type="dxa"/>
+              <w:left w:w="100" w:type="dxa"/>
+              <w:bottom w:w="60" w:type="dxa"/>
+              <w:right w:w="100" w:type="dxa"/>
+            </w:tcMar>
+            <w:tcBorders>
+              <w:top w:val="nil"/>
+              <w:left w:val="nil"/>
+              <w:bottom w:val="nil"/>
+              <w:right w:val="nil"/>
+            </w:tcBorders>
+          </w:tcPr>
+          <w:p>
+            <w:pPr>
+              <w:keepNext w:val="0"/>
+              <w:keepLines w:val="0"/>
+              <w:spacing w:before="0" w:after="0" w:line="269" w:lineRule="auto"/>
+            </w:pPr>
+            <w:r>
+              <w:rPr>
+                <w:b/>
+                <w:color w:val="FFFFFF"/>
+                <w:sz w:val="17"/>
+              </w:rPr>
+              <w:t>What it means for you</w:t>
+            </w:r>
+          </w:p>
+        </w:tc>
+      </w:tr>
+      <w:tr>
+        <w:trPr>
+          <w:cantSplit/>
+        </w:trPr>
+        <w:tc>
+          <w:tcPr>
+            <w:tcW w:type="dxa" w:w="1474"/>
+            <w:shd w:val="clear" w:color="auto" w:fill="FFFFFF"/>
+            <w:tcMar>
+              <w:top w:w="55" w:type="dxa"/>
+              <w:left w:w="100" w:type="dxa"/>
+              <w:bottom w:w="55" w:type="dxa"/>
+              <w:right w:w="100" w:type="dxa"/>
+            </w:tcMar>
+            <w:tcBorders>
+              <w:top w:val="nil"/>
+              <w:left w:val="nil"/>
+              <w:bottom w:val="single" w:sz="4" w:space="0" w:color="D9DEE4"/>
+              <w:right w:val="nil"/>
+            </w:tcBorders>
+          </w:tcPr>
+          <w:p>
+            <w:pPr>
+              <w:keepNext w:val="0"/>
+              <w:keepLines w:val="0"/>
+              <w:spacing w:before="0" w:after="0" w:line="264" w:lineRule="auto"/>
+            </w:pPr>
+            <w:r>
+              <w:rPr>
+                <w:sz w:val="17"/>
+              </w:rPr>
+              <w:t>CPU</w:t>
+            </w:r>
+          </w:p>
+        </w:tc>
+        <w:tc>
+          <w:tcPr>
+            <w:tcW w:type="dxa" w:w="2211"/>
+            <w:shd w:val="clear" w:color="auto" w:fill="FFFFFF"/>
+            <w:tcMar>
+              <w:top w:w="55" w:type="dxa"/>
+              <w:left w:w="100" w:type="dxa"/>
+              <w:bottom w:w="55" w:type="dxa"/>
+              <w:right w:w="100" w:type="dxa"/>
+            </w:tcMar>
+            <w:tcBorders>
+              <w:top w:val="nil"/>
+              <w:left w:val="nil"/>
+              <w:bottom w:val="single" w:sz="4" w:space="0" w:color="D9DEE4"/>
+              <w:right w:val="nil"/>
+            </w:tcBorders>
+          </w:tcPr>
+          <w:p>
+            <w:pPr>
+              <w:keepNext w:val="0"/>
+              <w:keepLines w:val="0"/>
+              <w:spacing w:before="0" w:after="0" w:line="264" w:lineRule="auto"/>
+            </w:pPr>
+            <w:r>
+              <w:rPr>
+                <w:sz w:val="17"/>
+              </w:rPr>
+              <w:t>4 cores, Cortex-A72, 1.5 GHz</w:t>
+            </w:r>
+          </w:p>
+        </w:tc>
+        <w:tc>
+          <w:tcPr>
+            <w:tcW w:type="dxa" w:w="2551"/>
+            <w:shd w:val="clear" w:color="auto" w:fill="FFFFFF"/>
+            <w:tcMar>
+              <w:top w:w="55" w:type="dxa"/>
+              <w:left w:w="100" w:type="dxa"/>
+              <w:bottom w:w="55" w:type="dxa"/>
+              <w:right w:w="100" w:type="dxa"/>
+            </w:tcMar>
+            <w:tcBorders>
+              <w:top w:val="nil"/>
+              <w:left w:val="nil"/>
+              <w:bottom w:val="single" w:sz="4" w:space="0" w:color="D9DEE4"/>
+              <w:right w:val="nil"/>
+            </w:tcBorders>
+          </w:tcPr>
+          <w:p>
+            <w:pPr>
+              <w:keepNext w:val="0"/>
+              <w:keepLines w:val="0"/>
+              <w:spacing w:before="0" w:after="0" w:line="264" w:lineRule="auto"/>
+            </w:pPr>
+            <w:r>
+              <w:rPr>
+                <w:sz w:val="17"/>
+              </w:rPr>
+              <w:t>4 cores, Cortex-A76, 2.4 GHz</w:t>
+            </w:r>
+          </w:p>
+        </w:tc>
+        <w:tc>
+          <w:tcPr>
+            <w:tcW w:type="dxa" w:w="3515"/>
+            <w:shd w:val="clear" w:color="auto" w:fill="FFFFFF"/>
+            <w:tcMar>
+              <w:top w:w="55" w:type="dxa"/>
+              <w:left w:w="100" w:type="dxa"/>
+              <w:bottom w:w="55" w:type="dxa"/>
+              <w:right w:w="100" w:type="dxa"/>
+            </w:tcMar>
+            <w:tcBorders>
+              <w:top w:val="nil"/>
+              <w:left w:val="nil"/>
+              <w:bottom w:val="single" w:sz="4" w:space="0" w:color="D9DEE4"/>
+              <w:right w:val="nil"/>
+            </w:tcBorders>
+          </w:tcPr>
+          <w:p>
+            <w:pPr>
+              <w:keepNext w:val="0"/>
+              <w:keepLines w:val="0"/>
+              <w:spacing w:before="0" w:after="0" w:line="264" w:lineRule="auto"/>
+            </w:pPr>
+            <w:r>
+              <w:rPr>
+                <w:sz w:val="17"/>
+              </w:rPr>
+              <w:t>The Pi 5 is clearly faster. The book's timings are Pi 5 numbers, so expect longer times on your Pi 4.</w:t>
+            </w:r>
+          </w:p>
+        </w:tc>
+      </w:tr>
+      <w:tr>
+        <w:trPr>
+          <w:cantSplit/>
+        </w:trPr>
+        <w:tc>
+          <w:tcPr>
+            <w:tcW w:type="dxa" w:w="1474"/>
+            <w:shd w:val="clear" w:color="auto" w:fill="F5F7FA"/>
+            <w:tcMar>
+              <w:top w:w="55" w:type="dxa"/>
+              <w:left w:w="100" w:type="dxa"/>
+              <w:bottom w:w="55" w:type="dxa"/>
+              <w:right w:w="100" w:type="dxa"/>
+            </w:tcMar>
+            <w:tcBorders>
+              <w:top w:val="nil"/>
+              <w:left w:val="nil"/>
+              <w:bottom w:val="single" w:sz="4" w:space="0" w:color="D9DEE4"/>
+              <w:right w:val="nil"/>
+            </w:tcBorders>
+          </w:tcPr>
+          <w:p>
+            <w:pPr>
+              <w:keepNext w:val="0"/>
+              <w:keepLines w:val="0"/>
+              <w:spacing w:before="0" w:after="0" w:line="264" w:lineRule="auto"/>
+            </w:pPr>
+            <w:r>
+              <w:rPr>
+                <w:sz w:val="17"/>
+              </w:rPr>
+              <w:t>RAM</w:t>
+            </w:r>
+          </w:p>
+        </w:tc>
+        <w:tc>
+          <w:tcPr>
+            <w:tcW w:type="dxa" w:w="2211"/>
+            <w:shd w:val="clear" w:color="auto" w:fill="F5F7FA"/>
+            <w:tcMar>
+              <w:top w:w="55" w:type="dxa"/>
+              <w:left w:w="100" w:type="dxa"/>
+              <w:bottom w:w="55" w:type="dxa"/>
+              <w:right w:w="100" w:type="dxa"/>
+            </w:tcMar>
+            <w:tcBorders>
+              <w:top w:val="nil"/>
+              <w:left w:val="nil"/>
+              <w:bottom w:val="single" w:sz="4" w:space="0" w:color="D9DEE4"/>
+              <w:right w:val="nil"/>
+            </w:tcBorders>
+          </w:tcPr>
+          <w:p>
+            <w:pPr>
+              <w:keepNext w:val="0"/>
+              <w:keepLines w:val="0"/>
+              <w:spacing w:before="0" w:after="0" w:line="264" w:lineRule="auto"/>
+            </w:pPr>
+            <w:r>
+              <w:rPr>
+                <w:sz w:val="17"/>
+              </w:rPr>
+              <w:t>up to 8 GB (yours: 4 GB)</w:t>
+            </w:r>
+          </w:p>
+        </w:tc>
+        <w:tc>
+          <w:tcPr>
+            <w:tcW w:type="dxa" w:w="2551"/>
+            <w:shd w:val="clear" w:color="auto" w:fill="F5F7FA"/>
+            <w:tcMar>
+              <w:top w:w="55" w:type="dxa"/>
+              <w:left w:w="100" w:type="dxa"/>
+              <w:bottom w:w="55" w:type="dxa"/>
+              <w:right w:w="100" w:type="dxa"/>
+            </w:tcMar>
+            <w:tcBorders>
+              <w:top w:val="nil"/>
+              <w:left w:val="nil"/>
+              <w:bottom w:val="single" w:sz="4" w:space="0" w:color="D9DEE4"/>
+              <w:right w:val="nil"/>
+            </w:tcBorders>
+          </w:tcPr>
+          <w:p>
+            <w:pPr>
+              <w:keepNext w:val="0"/>
+              <w:keepLines w:val="0"/>
+              <w:spacing w:before="0" w:after="0" w:line="264" w:lineRule="auto"/>
+            </w:pPr>
+            <w:r>
+              <w:rPr>
+                <w:sz w:val="17"/>
+              </w:rPr>
+              <w:t>2, 4 or 8 GB (a 16 GB model was added later)</w:t>
+            </w:r>
+          </w:p>
+        </w:tc>
+        <w:tc>
+          <w:tcPr>
+            <w:tcW w:type="dxa" w:w="3515"/>
+            <w:shd w:val="clear" w:color="auto" w:fill="F5F7FA"/>
+            <w:tcMar>
+              <w:top w:w="55" w:type="dxa"/>
+              <w:left w:w="100" w:type="dxa"/>
+              <w:bottom w:w="55" w:type="dxa"/>
+              <w:right w:w="100" w:type="dxa"/>
+            </w:tcMar>
+            <w:tcBorders>
+              <w:top w:val="nil"/>
+              <w:left w:val="nil"/>
+              <w:bottom w:val="single" w:sz="4" w:space="0" w:color="D9DEE4"/>
+              <w:right w:val="nil"/>
+            </w:tcBorders>
+          </w:tcPr>
+          <w:p>
+            <w:pPr>
+              <w:keepNext w:val="0"/>
+              <w:keepLines w:val="0"/>
+              <w:spacing w:before="0" w:after="0" w:line="264" w:lineRule="auto"/>
+            </w:pPr>
+            <w:r>
+              <w:rPr>
+                <w:sz w:val="17"/>
+              </w:rPr>
+              <w:t>More RAM = bigger models. This matters most in the language-model phase.</w:t>
+            </w:r>
+          </w:p>
+        </w:tc>
+      </w:tr>
+      <w:tr>
+        <w:trPr>
+          <w:cantSplit/>
+        </w:trPr>
+        <w:tc>
+          <w:tcPr>
+            <w:tcW w:type="dxa" w:w="1474"/>
+            <w:shd w:val="clear" w:color="auto" w:fill="FFFFFF"/>
+            <w:tcMar>
+              <w:top w:w="55" w:type="dxa"/>
+              <w:left w:w="100" w:type="dxa"/>
+              <w:bottom w:w="55" w:type="dxa"/>
+              <w:right w:w="100" w:type="dxa"/>
+            </w:tcMar>
+            <w:tcBorders>
+              <w:top w:val="nil"/>
+              <w:left w:val="nil"/>
+              <w:bottom w:val="single" w:sz="4" w:space="0" w:color="D9DEE4"/>
+              <w:right w:val="nil"/>
+            </w:tcBorders>
+          </w:tcPr>
+          <w:p>
+            <w:pPr>
+              <w:keepNext w:val="0"/>
+              <w:keepLines w:val="0"/>
+              <w:spacing w:before="0" w:after="0" w:line="264" w:lineRule="auto"/>
+            </w:pPr>
+            <w:r>
+              <w:rPr>
+                <w:sz w:val="17"/>
+              </w:rPr>
+              <w:t>Power supply</w:t>
+            </w:r>
+          </w:p>
+        </w:tc>
+        <w:tc>
+          <w:tcPr>
+            <w:tcW w:type="dxa" w:w="2211"/>
+            <w:shd w:val="clear" w:color="auto" w:fill="FFFFFF"/>
+            <w:tcMar>
+              <w:top w:w="55" w:type="dxa"/>
+              <w:left w:w="100" w:type="dxa"/>
+              <w:bottom w:w="55" w:type="dxa"/>
+              <w:right w:w="100" w:type="dxa"/>
+            </w:tcMar>
+            <w:tcBorders>
+              <w:top w:val="nil"/>
+              <w:left w:val="nil"/>
+              <w:bottom w:val="single" w:sz="4" w:space="0" w:color="D9DEE4"/>
+              <w:right w:val="nil"/>
+            </w:tcBorders>
+          </w:tcPr>
+          <w:p>
+            <w:pPr>
+              <w:keepNext w:val="0"/>
+              <w:keepLines w:val="0"/>
+              <w:spacing w:before="0" w:after="0" w:line="264" w:lineRule="auto"/>
+            </w:pPr>
+            <w:r>
+              <w:rPr>
+                <w:sz w:val="17"/>
+              </w:rPr>
+              <w:t>USB-C, 5 V / 3 A</w:t>
+            </w:r>
+          </w:p>
+        </w:tc>
+        <w:tc>
+          <w:tcPr>
+            <w:tcW w:type="dxa" w:w="2551"/>
+            <w:shd w:val="clear" w:color="auto" w:fill="FFFFFF"/>
+            <w:tcMar>
+              <w:top w:w="55" w:type="dxa"/>
+              <w:left w:w="100" w:type="dxa"/>
+              <w:bottom w:w="55" w:type="dxa"/>
+              <w:right w:w="100" w:type="dxa"/>
+            </w:tcMar>
+            <w:tcBorders>
+              <w:top w:val="nil"/>
+              <w:left w:val="nil"/>
+              <w:bottom w:val="single" w:sz="4" w:space="0" w:color="D9DEE4"/>
+              <w:right w:val="nil"/>
+            </w:tcBorders>
+          </w:tcPr>
+          <w:p>
+            <w:pPr>
+              <w:keepNext w:val="0"/>
+              <w:keepLines w:val="0"/>
+              <w:spacing w:before="0" w:after="0" w:line="264" w:lineRule="auto"/>
+            </w:pPr>
+            <w:r>
+              <w:rPr>
+                <w:sz w:val="17"/>
+              </w:rPr>
+              <w:t>USB-C, 5 V / 5 A (27 W) recommended; a 3 A supply works but limits USB devices to 600 mA</w:t>
+            </w:r>
+          </w:p>
+        </w:tc>
+        <w:tc>
+          <w:tcPr>
+            <w:tcW w:type="dxa" w:w="3515"/>
+            <w:shd w:val="clear" w:color="auto" w:fill="FFFFFF"/>
+            <w:tcMar>
+              <w:top w:w="55" w:type="dxa"/>
+              <w:left w:w="100" w:type="dxa"/>
+              <w:bottom w:w="55" w:type="dxa"/>
+              <w:right w:w="100" w:type="dxa"/>
+            </w:tcMar>
+            <w:tcBorders>
+              <w:top w:val="nil"/>
+              <w:left w:val="nil"/>
+              <w:bottom w:val="single" w:sz="4" w:space="0" w:color="D9DEE4"/>
+              <w:right w:val="nil"/>
+            </w:tcBorders>
+          </w:tcPr>
+          <w:p>
+            <w:pPr>
+              <w:keepNext w:val="0"/>
+              <w:keepLines w:val="0"/>
+              <w:spacing w:before="0" w:after="0" w:line="264" w:lineRule="auto"/>
+            </w:pPr>
+            <w:r>
+              <w:rPr>
+                <w:sz w:val="17"/>
+              </w:rPr>
+              <w:t>A weak charger causes random crashes on both boards.</w:t>
+            </w:r>
+          </w:p>
+        </w:tc>
+      </w:tr>
+      <w:tr>
+        <w:trPr>
+          <w:cantSplit/>
+        </w:trPr>
+        <w:tc>
+          <w:tcPr>
+            <w:tcW w:type="dxa" w:w="1474"/>
+            <w:shd w:val="clear" w:color="auto" w:fill="F5F7FA"/>
+            <w:tcMar>
+              <w:top w:w="55" w:type="dxa"/>
+              <w:left w:w="100" w:type="dxa"/>
+              <w:bottom w:w="55" w:type="dxa"/>
+              <w:right w:w="100" w:type="dxa"/>
+            </w:tcMar>
+            <w:tcBorders>
+              <w:top w:val="nil"/>
+              <w:left w:val="nil"/>
+              <w:bottom w:val="single" w:sz="4" w:space="0" w:color="D9DEE4"/>
+              <w:right w:val="nil"/>
+            </w:tcBorders>
+          </w:tcPr>
+          <w:p>
+            <w:pPr>
+              <w:keepNext w:val="0"/>
+              <w:keepLines w:val="0"/>
+              <w:spacing w:before="0" w:after="0" w:line="264" w:lineRule="auto"/>
+            </w:pPr>
+            <w:r>
+              <w:rPr>
+                <w:sz w:val="17"/>
+              </w:rPr>
+              <w:t>Power button</w:t>
+            </w:r>
+          </w:p>
+        </w:tc>
+        <w:tc>
+          <w:tcPr>
+            <w:tcW w:type="dxa" w:w="2211"/>
+            <w:shd w:val="clear" w:color="auto" w:fill="F5F7FA"/>
+            <w:tcMar>
+              <w:top w:w="55" w:type="dxa"/>
+              <w:left w:w="100" w:type="dxa"/>
+              <w:bottom w:w="55" w:type="dxa"/>
+              <w:right w:w="100" w:type="dxa"/>
+            </w:tcMar>
+            <w:tcBorders>
+              <w:top w:val="nil"/>
+              <w:left w:val="nil"/>
+              <w:bottom w:val="single" w:sz="4" w:space="0" w:color="D9DEE4"/>
+              <w:right w:val="nil"/>
+            </w:tcBorders>
+          </w:tcPr>
+          <w:p>
+            <w:pPr>
+              <w:keepNext w:val="0"/>
+              <w:keepLines w:val="0"/>
+              <w:spacing w:before="0" w:after="0" w:line="264" w:lineRule="auto"/>
+            </w:pPr>
+            <w:r>
+              <w:rPr>
+                <w:sz w:val="17"/>
+              </w:rPr>
+              <w:t>none: plugging in switches it on</w:t>
+            </w:r>
+          </w:p>
+        </w:tc>
+        <w:tc>
+          <w:tcPr>
+            <w:tcW w:type="dxa" w:w="2551"/>
+            <w:shd w:val="clear" w:color="auto" w:fill="F5F7FA"/>
+            <w:tcMar>
+              <w:top w:w="55" w:type="dxa"/>
+              <w:left w:w="100" w:type="dxa"/>
+              <w:bottom w:w="55" w:type="dxa"/>
+              <w:right w:w="100" w:type="dxa"/>
+            </w:tcMar>
+            <w:tcBorders>
+              <w:top w:val="nil"/>
+              <w:left w:val="nil"/>
+              <w:bottom w:val="single" w:sz="4" w:space="0" w:color="D9DEE4"/>
+              <w:right w:val="nil"/>
+            </w:tcBorders>
+          </w:tcPr>
+          <w:p>
+            <w:pPr>
+              <w:keepNext w:val="0"/>
+              <w:keepLines w:val="0"/>
+              <w:spacing w:before="0" w:after="0" w:line="264" w:lineRule="auto"/>
+            </w:pPr>
+            <w:r>
+              <w:rPr>
+                <w:sz w:val="17"/>
+              </w:rPr>
+              <w:t>yes</w:t>
+            </w:r>
+          </w:p>
+        </w:tc>
+        <w:tc>
+          <w:tcPr>
+            <w:tcW w:type="dxa" w:w="3515"/>
+            <w:shd w:val="clear" w:color="auto" w:fill="F5F7FA"/>
+            <w:tcMar>
+              <w:top w:w="55" w:type="dxa"/>
+              <w:left w:w="100" w:type="dxa"/>
+              <w:bottom w:w="55" w:type="dxa"/>
+              <w:right w:w="100" w:type="dxa"/>
+            </w:tcMar>
+            <w:tcBorders>
+              <w:top w:val="nil"/>
+              <w:left w:val="nil"/>
+              <w:bottom w:val="single" w:sz="4" w:space="0" w:color="D9DEE4"/>
+              <w:right w:val="nil"/>
+            </w:tcBorders>
+          </w:tcPr>
+          <w:p>
+            <w:pPr>
+              <w:keepNext w:val="0"/>
+              <w:keepLines w:val="0"/>
+              <w:spacing w:before="0" w:after="0" w:line="264" w:lineRule="auto"/>
+            </w:pPr>
+            <w:r>
+              <w:rPr>
+                <w:sz w:val="17"/>
+              </w:rPr>
+              <w:t>Restart a halted Pi 4 by unplugging and replugging; on a Pi 5 press the button.</w:t>
+            </w:r>
+          </w:p>
+        </w:tc>
+      </w:tr>
+      <w:tr>
+        <w:trPr>
+          <w:cantSplit/>
+        </w:trPr>
+        <w:tc>
+          <w:tcPr>
+            <w:tcW w:type="dxa" w:w="1474"/>
+            <w:shd w:val="clear" w:color="auto" w:fill="FFFFFF"/>
+            <w:tcMar>
+              <w:top w:w="55" w:type="dxa"/>
+              <w:left w:w="100" w:type="dxa"/>
+              <w:bottom w:w="55" w:type="dxa"/>
+              <w:right w:w="100" w:type="dxa"/>
+            </w:tcMar>
+            <w:tcBorders>
+              <w:top w:val="nil"/>
+              <w:left w:val="nil"/>
+              <w:bottom w:val="single" w:sz="4" w:space="0" w:color="D9DEE4"/>
+              <w:right w:val="nil"/>
+            </w:tcBorders>
+          </w:tcPr>
+          <w:p>
+            <w:pPr>
+              <w:keepNext w:val="0"/>
+              <w:keepLines w:val="0"/>
+              <w:spacing w:before="0" w:after="0" w:line="264" w:lineRule="auto"/>
+            </w:pPr>
+            <w:r>
+              <w:rPr>
+                <w:sz w:val="17"/>
+              </w:rPr>
+              <w:t>Cooling</w:t>
+            </w:r>
+          </w:p>
+        </w:tc>
+        <w:tc>
+          <w:tcPr>
+            <w:tcW w:type="dxa" w:w="2211"/>
+            <w:shd w:val="clear" w:color="auto" w:fill="FFFFFF"/>
+            <w:tcMar>
+              <w:top w:w="55" w:type="dxa"/>
+              <w:left w:w="100" w:type="dxa"/>
+              <w:bottom w:w="55" w:type="dxa"/>
+              <w:right w:w="100" w:type="dxa"/>
+            </w:tcMar>
+            <w:tcBorders>
+              <w:top w:val="nil"/>
+              <w:left w:val="nil"/>
+              <w:bottom w:val="single" w:sz="4" w:space="0" w:color="D9DEE4"/>
+              <w:right w:val="nil"/>
+            </w:tcBorders>
+          </w:tcPr>
+          <w:p>
+            <w:pPr>
+              <w:keepNext w:val="0"/>
+              <w:keepLines w:val="0"/>
+              <w:spacing w:before="0" w:after="0" w:line="264" w:lineRule="auto"/>
+            </w:pPr>
+            <w:r>
+              <w:rPr>
+                <w:sz w:val="17"/>
+              </w:rPr>
+              <w:t>a heatsink or fan case is advisable for long runs</w:t>
+            </w:r>
+          </w:p>
+        </w:tc>
+        <w:tc>
+          <w:tcPr>
+            <w:tcW w:type="dxa" w:w="2551"/>
+            <w:shd w:val="clear" w:color="auto" w:fill="FFFFFF"/>
+            <w:tcMar>
+              <w:top w:w="55" w:type="dxa"/>
+              <w:left w:w="100" w:type="dxa"/>
+              <w:bottom w:w="55" w:type="dxa"/>
+              <w:right w:w="100" w:type="dxa"/>
+            </w:tcMar>
+            <w:tcBorders>
+              <w:top w:val="nil"/>
+              <w:left w:val="nil"/>
+              <w:bottom w:val="single" w:sz="4" w:space="0" w:color="D9DEE4"/>
+              <w:right w:val="nil"/>
+            </w:tcBorders>
+          </w:tcPr>
+          <w:p>
+            <w:pPr>
+              <w:keepNext w:val="0"/>
+              <w:keepLines w:val="0"/>
+              <w:spacing w:before="0" w:after="0" w:line="264" w:lineRule="auto"/>
+            </w:pPr>
+            <w:r>
+              <w:rPr>
+                <w:sz w:val="17"/>
+              </w:rPr>
+              <w:t>runs hotter; has a fan connector; an active cooler is advisable for long AI runs</w:t>
+            </w:r>
+          </w:p>
+        </w:tc>
+        <w:tc>
+          <w:tcPr>
+            <w:tcW w:type="dxa" w:w="3515"/>
+            <w:shd w:val="clear" w:color="auto" w:fill="FFFFFF"/>
+            <w:tcMar>
+              <w:top w:w="55" w:type="dxa"/>
+              <w:left w:w="100" w:type="dxa"/>
+              <w:bottom w:w="55" w:type="dxa"/>
+              <w:right w:w="100" w:type="dxa"/>
+            </w:tcMar>
+            <w:tcBorders>
+              <w:top w:val="nil"/>
+              <w:left w:val="nil"/>
+              <w:bottom w:val="single" w:sz="4" w:space="0" w:color="D9DEE4"/>
+              <w:right w:val="nil"/>
+            </w:tcBorders>
+          </w:tcPr>
+          <w:p>
+            <w:pPr>
+              <w:keepNext w:val="0"/>
+              <w:keepLines w:val="0"/>
+              <w:spacing w:before="0" w:after="0" w:line="264" w:lineRule="auto"/>
+            </w:pPr>
+            <w:r>
+              <w:rPr>
+                <w:sz w:val="17"/>
+              </w:rPr>
+              <w:t xml:space="preserve">Check the temperature while a model runs: </w:t>
+            </w:r>
+            <w:r>
+              <w:rPr>
+                <w:rFonts w:ascii="Courier New" w:hAnsi="Courier New" w:eastAsia="Courier New"/>
+                <w:color w:val="9B1C45"/>
+                <w:sz w:val="15"/>
+              </w:rPr>
+              <w:t>vcgencmd measure_temp</w:t>
+            </w:r>
+            <w:r>
+              <w:rPr>
+                <w:sz w:val="17"/>
+              </w:rPr>
+              <w:t>.</w:t>
+            </w:r>
+          </w:p>
+        </w:tc>
+      </w:tr>
+      <w:tr>
+        <w:trPr>
+          <w:cantSplit/>
+        </w:trPr>
+        <w:tc>
+          <w:tcPr>
+            <w:tcW w:type="dxa" w:w="1474"/>
+            <w:shd w:val="clear" w:color="auto" w:fill="F5F7FA"/>
+            <w:tcMar>
+              <w:top w:w="55" w:type="dxa"/>
+              <w:left w:w="100" w:type="dxa"/>
+              <w:bottom w:w="55" w:type="dxa"/>
+              <w:right w:w="100" w:type="dxa"/>
+            </w:tcMar>
+            <w:tcBorders>
+              <w:top w:val="nil"/>
+              <w:left w:val="nil"/>
+              <w:bottom w:val="single" w:sz="4" w:space="0" w:color="D9DEE4"/>
+              <w:right w:val="nil"/>
+            </w:tcBorders>
+          </w:tcPr>
+          <w:p>
+            <w:pPr>
+              <w:keepNext w:val="0"/>
+              <w:keepLines w:val="0"/>
+              <w:spacing w:before="0" w:after="0" w:line="264" w:lineRule="auto"/>
+            </w:pPr>
+            <w:r>
+              <w:rPr>
+                <w:sz w:val="17"/>
+              </w:rPr>
+              <w:t>Camera / display ports</w:t>
+            </w:r>
+          </w:p>
+        </w:tc>
+        <w:tc>
+          <w:tcPr>
+            <w:tcW w:type="dxa" w:w="2211"/>
+            <w:shd w:val="clear" w:color="auto" w:fill="F5F7FA"/>
+            <w:tcMar>
+              <w:top w:w="55" w:type="dxa"/>
+              <w:left w:w="100" w:type="dxa"/>
+              <w:bottom w:w="55" w:type="dxa"/>
+              <w:right w:w="100" w:type="dxa"/>
+            </w:tcMar>
+            <w:tcBorders>
+              <w:top w:val="nil"/>
+              <w:left w:val="nil"/>
+              <w:bottom w:val="single" w:sz="4" w:space="0" w:color="D9DEE4"/>
+              <w:right w:val="nil"/>
+            </w:tcBorders>
+          </w:tcPr>
+          <w:p>
+            <w:pPr>
+              <w:keepNext w:val="0"/>
+              <w:keepLines w:val="0"/>
+              <w:spacing w:before="0" w:after="0" w:line="264" w:lineRule="auto"/>
+            </w:pPr>
+            <w:r>
+              <w:rPr>
+                <w:sz w:val="17"/>
+              </w:rPr>
+              <w:t>1 camera (CSI) + 1 display (DSI), standard 15-pin ribbon</w:t>
+            </w:r>
+          </w:p>
+        </w:tc>
+        <w:tc>
+          <w:tcPr>
+            <w:tcW w:type="dxa" w:w="2551"/>
+            <w:shd w:val="clear" w:color="auto" w:fill="F5F7FA"/>
+            <w:tcMar>
+              <w:top w:w="55" w:type="dxa"/>
+              <w:left w:w="100" w:type="dxa"/>
+              <w:bottom w:w="55" w:type="dxa"/>
+              <w:right w:w="100" w:type="dxa"/>
+            </w:tcMar>
+            <w:tcBorders>
+              <w:top w:val="nil"/>
+              <w:left w:val="nil"/>
+              <w:bottom w:val="single" w:sz="4" w:space="0" w:color="D9DEE4"/>
+              <w:right w:val="nil"/>
+            </w:tcBorders>
+          </w:tcPr>
+          <w:p>
+            <w:pPr>
+              <w:keepNext w:val="0"/>
+              <w:keepLines w:val="0"/>
+              <w:spacing w:before="0" w:after="0" w:line="264" w:lineRule="auto"/>
+            </w:pPr>
+            <w:r>
+              <w:rPr>
+                <w:sz w:val="17"/>
+              </w:rPr>
+              <w:t>two 4-lane camera/display ports, smaller connector</w:t>
+            </w:r>
+          </w:p>
+        </w:tc>
+        <w:tc>
+          <w:tcPr>
+            <w:tcW w:type="dxa" w:w="3515"/>
+            <w:shd w:val="clear" w:color="auto" w:fill="F5F7FA"/>
+            <w:tcMar>
+              <w:top w:w="55" w:type="dxa"/>
+              <w:left w:w="100" w:type="dxa"/>
+              <w:bottom w:w="55" w:type="dxa"/>
+              <w:right w:w="100" w:type="dxa"/>
+            </w:tcMar>
+            <w:tcBorders>
+              <w:top w:val="nil"/>
+              <w:left w:val="nil"/>
+              <w:bottom w:val="single" w:sz="4" w:space="0" w:color="D9DEE4"/>
+              <w:right w:val="nil"/>
+            </w:tcBorders>
+          </w:tcPr>
+          <w:p>
+            <w:pPr>
+              <w:keepNext w:val="0"/>
+              <w:keepLines w:val="0"/>
+              <w:spacing w:before="0" w:after="0" w:line="264" w:lineRule="auto"/>
+            </w:pPr>
+            <w:r>
+              <w:rPr>
+                <w:sz w:val="17"/>
+              </w:rPr>
+              <w:t>The camera cable differs between the boards - check this before buying a cable (Day 4).</w:t>
+            </w:r>
+          </w:p>
+        </w:tc>
+      </w:tr>
+      <w:tr>
+        <w:trPr>
+          <w:cantSplit/>
+        </w:trPr>
+        <w:tc>
+          <w:tcPr>
+            <w:tcW w:type="dxa" w:w="1474"/>
+            <w:shd w:val="clear" w:color="auto" w:fill="FFFFFF"/>
+            <w:tcMar>
+              <w:top w:w="55" w:type="dxa"/>
+              <w:left w:w="100" w:type="dxa"/>
+              <w:bottom w:w="55" w:type="dxa"/>
+              <w:right w:w="100" w:type="dxa"/>
+            </w:tcMar>
+            <w:tcBorders>
+              <w:top w:val="nil"/>
+              <w:left w:val="nil"/>
+              <w:bottom w:val="single" w:sz="4" w:space="0" w:color="D9DEE4"/>
+              <w:right w:val="nil"/>
+            </w:tcBorders>
+          </w:tcPr>
+          <w:p>
+            <w:pPr>
+              <w:keepNext w:val="0"/>
+              <w:keepLines w:val="0"/>
+              <w:spacing w:before="0" w:after="0" w:line="264" w:lineRule="auto"/>
+            </w:pPr>
+            <w:r>
+              <w:rPr>
+                <w:sz w:val="17"/>
+              </w:rPr>
+              <w:t>PCIe</w:t>
+            </w:r>
+          </w:p>
+        </w:tc>
+        <w:tc>
+          <w:tcPr>
+            <w:tcW w:type="dxa" w:w="2211"/>
+            <w:shd w:val="clear" w:color="auto" w:fill="FFFFFF"/>
+            <w:tcMar>
+              <w:top w:w="55" w:type="dxa"/>
+              <w:left w:w="100" w:type="dxa"/>
+              <w:bottom w:w="55" w:type="dxa"/>
+              <w:right w:w="100" w:type="dxa"/>
+            </w:tcMar>
+            <w:tcBorders>
+              <w:top w:val="nil"/>
+              <w:left w:val="nil"/>
+              <w:bottom w:val="single" w:sz="4" w:space="0" w:color="D9DEE4"/>
+              <w:right w:val="nil"/>
+            </w:tcBorders>
+          </w:tcPr>
+          <w:p>
+            <w:pPr>
+              <w:keepNext w:val="0"/>
+              <w:keepLines w:val="0"/>
+              <w:spacing w:before="0" w:after="0" w:line="264" w:lineRule="auto"/>
+            </w:pPr>
+            <w:r>
+              <w:rPr>
+                <w:sz w:val="17"/>
+              </w:rPr>
+              <w:t>none</w:t>
+            </w:r>
+          </w:p>
+        </w:tc>
+        <w:tc>
+          <w:tcPr>
+            <w:tcW w:type="dxa" w:w="2551"/>
+            <w:shd w:val="clear" w:color="auto" w:fill="FFFFFF"/>
+            <w:tcMar>
+              <w:top w:w="55" w:type="dxa"/>
+              <w:left w:w="100" w:type="dxa"/>
+              <w:bottom w:w="55" w:type="dxa"/>
+              <w:right w:w="100" w:type="dxa"/>
+            </w:tcMar>
+            <w:tcBorders>
+              <w:top w:val="nil"/>
+              <w:left w:val="nil"/>
+              <w:bottom w:val="single" w:sz="4" w:space="0" w:color="D9DEE4"/>
+              <w:right w:val="nil"/>
+            </w:tcBorders>
+          </w:tcPr>
+          <w:p>
+            <w:pPr>
+              <w:keepNext w:val="0"/>
+              <w:keepLines w:val="0"/>
+              <w:spacing w:before="0" w:after="0" w:line="264" w:lineRule="auto"/>
+            </w:pPr>
+            <w:r>
+              <w:rPr>
+                <w:sz w:val="17"/>
+              </w:rPr>
+              <w:t>PCIe 2.0 x1 connector</w:t>
+            </w:r>
+          </w:p>
+        </w:tc>
+        <w:tc>
+          <w:tcPr>
+            <w:tcW w:type="dxa" w:w="3515"/>
+            <w:shd w:val="clear" w:color="auto" w:fill="FFFFFF"/>
+            <w:tcMar>
+              <w:top w:w="55" w:type="dxa"/>
+              <w:left w:w="100" w:type="dxa"/>
+              <w:bottom w:w="55" w:type="dxa"/>
+              <w:right w:w="100" w:type="dxa"/>
+            </w:tcMar>
+            <w:tcBorders>
+              <w:top w:val="nil"/>
+              <w:left w:val="nil"/>
+              <w:bottom w:val="single" w:sz="4" w:space="0" w:color="D9DEE4"/>
+              <w:right w:val="nil"/>
+            </w:tcBorders>
+          </w:tcPr>
+          <w:p>
+            <w:pPr>
+              <w:keepNext w:val="0"/>
+              <w:keepLines w:val="0"/>
+              <w:spacing w:before="0" w:after="0" w:line="264" w:lineRule="auto"/>
+            </w:pPr>
+            <w:r>
+              <w:rPr>
+                <w:sz w:val="17"/>
+              </w:rPr>
+              <w:t>Not needed in this course.</w:t>
+            </w:r>
+          </w:p>
+        </w:tc>
+      </w:tr>
+      <w:tr>
+        <w:trPr>
+          <w:cantSplit/>
+        </w:trPr>
+        <w:tc>
+          <w:tcPr>
+            <w:tcW w:type="dxa" w:w="1474"/>
+            <w:shd w:val="clear" w:color="auto" w:fill="F5F7FA"/>
+            <w:tcMar>
+              <w:top w:w="55" w:type="dxa"/>
+              <w:left w:w="100" w:type="dxa"/>
+              <w:bottom w:w="55" w:type="dxa"/>
+              <w:right w:w="100" w:type="dxa"/>
+            </w:tcMar>
+            <w:tcBorders>
+              <w:top w:val="nil"/>
+              <w:left w:val="nil"/>
+              <w:bottom w:val="single" w:sz="4" w:space="0" w:color="D9DEE4"/>
+              <w:right w:val="nil"/>
+            </w:tcBorders>
+          </w:tcPr>
+          <w:p>
+            <w:pPr>
+              <w:keepNext w:val="0"/>
+              <w:keepLines w:val="0"/>
+              <w:spacing w:before="0" w:after="0" w:line="264" w:lineRule="auto"/>
+            </w:pPr>
+            <w:r>
+              <w:rPr>
+                <w:sz w:val="17"/>
+              </w:rPr>
+              <w:t>Wi-Fi / Bluetooth</w:t>
+            </w:r>
+          </w:p>
+        </w:tc>
+        <w:tc>
+          <w:tcPr>
+            <w:tcW w:type="dxa" w:w="2211"/>
+            <w:shd w:val="clear" w:color="auto" w:fill="F5F7FA"/>
+            <w:tcMar>
+              <w:top w:w="55" w:type="dxa"/>
+              <w:left w:w="100" w:type="dxa"/>
+              <w:bottom w:w="55" w:type="dxa"/>
+              <w:right w:w="100" w:type="dxa"/>
+            </w:tcMar>
+            <w:tcBorders>
+              <w:top w:val="nil"/>
+              <w:left w:val="nil"/>
+              <w:bottom w:val="single" w:sz="4" w:space="0" w:color="D9DEE4"/>
+              <w:right w:val="nil"/>
+            </w:tcBorders>
+          </w:tcPr>
+          <w:p>
+            <w:pPr>
+              <w:keepNext w:val="0"/>
+              <w:keepLines w:val="0"/>
+              <w:spacing w:before="0" w:after="0" w:line="264" w:lineRule="auto"/>
+            </w:pPr>
+            <w:r>
+              <w:rPr>
+                <w:sz w:val="17"/>
+              </w:rPr>
+              <w:t>dual-band, Bluetooth 5.0</w:t>
+            </w:r>
+          </w:p>
+        </w:tc>
+        <w:tc>
+          <w:tcPr>
+            <w:tcW w:type="dxa" w:w="2551"/>
+            <w:shd w:val="clear" w:color="auto" w:fill="F5F7FA"/>
+            <w:tcMar>
+              <w:top w:w="55" w:type="dxa"/>
+              <w:left w:w="100" w:type="dxa"/>
+              <w:bottom w:w="55" w:type="dxa"/>
+              <w:right w:w="100" w:type="dxa"/>
+            </w:tcMar>
+            <w:tcBorders>
+              <w:top w:val="nil"/>
+              <w:left w:val="nil"/>
+              <w:bottom w:val="single" w:sz="4" w:space="0" w:color="D9DEE4"/>
+              <w:right w:val="nil"/>
+            </w:tcBorders>
+          </w:tcPr>
+          <w:p>
+            <w:pPr>
+              <w:keepNext w:val="0"/>
+              <w:keepLines w:val="0"/>
+              <w:spacing w:before="0" w:after="0" w:line="264" w:lineRule="auto"/>
+            </w:pPr>
+            <w:r>
+              <w:rPr>
+                <w:sz w:val="17"/>
+              </w:rPr>
+              <w:t>dual-band 802.11ac, Bluetooth 5.0</w:t>
+            </w:r>
+          </w:p>
+        </w:tc>
+        <w:tc>
+          <w:tcPr>
+            <w:tcW w:type="dxa" w:w="3515"/>
+            <w:shd w:val="clear" w:color="auto" w:fill="F5F7FA"/>
+            <w:tcMar>
+              <w:top w:w="55" w:type="dxa"/>
+              <w:left w:w="100" w:type="dxa"/>
+              <w:bottom w:w="55" w:type="dxa"/>
+              <w:right w:w="100" w:type="dxa"/>
+            </w:tcMar>
+            <w:tcBorders>
+              <w:top w:val="nil"/>
+              <w:left w:val="nil"/>
+              <w:bottom w:val="single" w:sz="4" w:space="0" w:color="D9DEE4"/>
+              <w:right w:val="nil"/>
+            </w:tcBorders>
+          </w:tcPr>
+          <w:p>
+            <w:pPr>
+              <w:keepNext w:val="0"/>
+              <w:keepLines w:val="0"/>
+              <w:spacing w:before="0" w:after="0" w:line="264" w:lineRule="auto"/>
+            </w:pPr>
+            <w:r>
+              <w:rPr>
+                <w:sz w:val="17"/>
+              </w:rPr>
+              <w:t>Same for our purposes.</w:t>
+            </w:r>
+          </w:p>
+        </w:tc>
+      </w:tr>
+      <w:tr>
+        <w:trPr>
+          <w:cantSplit/>
+        </w:trPr>
+        <w:tc>
+          <w:tcPr>
+            <w:tcW w:type="dxa" w:w="1474"/>
+            <w:shd w:val="clear" w:color="auto" w:fill="FFFFFF"/>
+            <w:tcMar>
+              <w:top w:w="55" w:type="dxa"/>
+              <w:left w:w="100" w:type="dxa"/>
+              <w:bottom w:w="55" w:type="dxa"/>
+              <w:right w:w="100" w:type="dxa"/>
+            </w:tcMar>
+            <w:tcBorders>
+              <w:top w:val="nil"/>
+              <w:left w:val="nil"/>
+              <w:bottom w:val="single" w:sz="4" w:space="0" w:color="D9DEE4"/>
+              <w:right w:val="nil"/>
+            </w:tcBorders>
+          </w:tcPr>
+          <w:p>
+            <w:pPr>
+              <w:keepNext w:val="0"/>
+              <w:keepLines w:val="0"/>
+              <w:spacing w:before="0" w:after="0" w:line="264" w:lineRule="auto"/>
+            </w:pPr>
+            <w:r>
+              <w:rPr>
+                <w:sz w:val="17"/>
+              </w:rPr>
+              <w:t>Operating system</w:t>
+            </w:r>
+          </w:p>
+        </w:tc>
+        <w:tc>
+          <w:tcPr>
+            <w:tcW w:type="dxa" w:w="2211"/>
+            <w:shd w:val="clear" w:color="auto" w:fill="FFFFFF"/>
+            <w:tcMar>
+              <w:top w:w="55" w:type="dxa"/>
+              <w:left w:w="100" w:type="dxa"/>
+              <w:bottom w:w="55" w:type="dxa"/>
+              <w:right w:w="100" w:type="dxa"/>
+            </w:tcMar>
+            <w:tcBorders>
+              <w:top w:val="nil"/>
+              <w:left w:val="nil"/>
+              <w:bottom w:val="single" w:sz="4" w:space="0" w:color="D9DEE4"/>
+              <w:right w:val="nil"/>
+            </w:tcBorders>
+          </w:tcPr>
+          <w:p>
+            <w:pPr>
+              <w:keepNext w:val="0"/>
+              <w:keepLines w:val="0"/>
+              <w:spacing w:before="0" w:after="0" w:line="264" w:lineRule="auto"/>
+            </w:pPr>
+            <w:r>
+              <w:rPr>
+                <w:sz w:val="17"/>
+              </w:rPr>
+              <w:t>runs older and newer releases</w:t>
+            </w:r>
+          </w:p>
+        </w:tc>
+        <w:tc>
+          <w:tcPr>
+            <w:tcW w:type="dxa" w:w="2551"/>
+            <w:shd w:val="clear" w:color="auto" w:fill="FFFFFF"/>
+            <w:tcMar>
+              <w:top w:w="55" w:type="dxa"/>
+              <w:left w:w="100" w:type="dxa"/>
+              <w:bottom w:w="55" w:type="dxa"/>
+              <w:right w:w="100" w:type="dxa"/>
+            </w:tcMar>
+            <w:tcBorders>
+              <w:top w:val="nil"/>
+              <w:left w:val="nil"/>
+              <w:bottom w:val="single" w:sz="4" w:space="0" w:color="D9DEE4"/>
+              <w:right w:val="nil"/>
+            </w:tcBorders>
+          </w:tcPr>
+          <w:p>
+            <w:pPr>
+              <w:keepNext w:val="0"/>
+              <w:keepLines w:val="0"/>
+              <w:spacing w:before="0" w:after="0" w:line="264" w:lineRule="auto"/>
+            </w:pPr>
+            <w:r>
+              <w:rPr>
+                <w:sz w:val="17"/>
+              </w:rPr>
+              <w:t>needs a recent Raspberry Pi OS (Bookworm or newer)</w:t>
+            </w:r>
+          </w:p>
+        </w:tc>
+        <w:tc>
+          <w:tcPr>
+            <w:tcW w:type="dxa" w:w="3515"/>
+            <w:shd w:val="clear" w:color="auto" w:fill="FFFFFF"/>
+            <w:tcMar>
+              <w:top w:w="55" w:type="dxa"/>
+              <w:left w:w="100" w:type="dxa"/>
+              <w:bottom w:w="55" w:type="dxa"/>
+              <w:right w:w="100" w:type="dxa"/>
+            </w:tcMar>
+            <w:tcBorders>
+              <w:top w:val="nil"/>
+              <w:left w:val="nil"/>
+              <w:bottom w:val="single" w:sz="4" w:space="0" w:color="D9DEE4"/>
+              <w:right w:val="nil"/>
+            </w:tcBorders>
+          </w:tcPr>
+          <w:p>
+            <w:pPr>
+              <w:keepNext w:val="0"/>
+              <w:keepLines w:val="0"/>
+              <w:spacing w:before="0" w:after="0" w:line="264" w:lineRule="auto"/>
+            </w:pPr>
+            <w:r>
+              <w:rPr>
+                <w:sz w:val="17"/>
+              </w:rPr>
+              <w:t>Always take the newest image Imager offers.</w:t>
+            </w:r>
+          </w:p>
+        </w:tc>
+      </w:tr>
+      <w:tr>
+        <w:trPr>
+          <w:cantSplit/>
+        </w:trPr>
+        <w:tc>
+          <w:tcPr>
+            <w:tcW w:type="dxa" w:w="1474"/>
+            <w:shd w:val="clear" w:color="auto" w:fill="F5F7FA"/>
+            <w:tcMar>
+              <w:top w:w="55" w:type="dxa"/>
+              <w:left w:w="100" w:type="dxa"/>
+              <w:bottom w:w="55" w:type="dxa"/>
+              <w:right w:w="100" w:type="dxa"/>
+            </w:tcMar>
+            <w:tcBorders>
+              <w:top w:val="nil"/>
+              <w:left w:val="nil"/>
+              <w:bottom w:val="single" w:sz="4" w:space="0" w:color="D9DEE4"/>
+              <w:right w:val="nil"/>
+            </w:tcBorders>
+          </w:tcPr>
+          <w:p>
+            <w:pPr>
+              <w:keepNext w:val="0"/>
+              <w:keepLines w:val="0"/>
+              <w:spacing w:before="0" w:after="0" w:line="264" w:lineRule="auto"/>
+            </w:pPr>
+            <w:r>
+              <w:rPr>
+                <w:sz w:val="17"/>
+              </w:rPr>
+              <w:t>In Imager</w:t>
+            </w:r>
+          </w:p>
+        </w:tc>
+        <w:tc>
+          <w:tcPr>
+            <w:tcW w:type="dxa" w:w="2211"/>
+            <w:shd w:val="clear" w:color="auto" w:fill="F5F7FA"/>
+            <w:tcMar>
+              <w:top w:w="55" w:type="dxa"/>
+              <w:left w:w="100" w:type="dxa"/>
+              <w:bottom w:w="55" w:type="dxa"/>
+              <w:right w:w="100" w:type="dxa"/>
+            </w:tcMar>
+            <w:tcBorders>
+              <w:top w:val="nil"/>
+              <w:left w:val="nil"/>
+              <w:bottom w:val="single" w:sz="4" w:space="0" w:color="D9DEE4"/>
+              <w:right w:val="nil"/>
+            </w:tcBorders>
+          </w:tcPr>
+          <w:p>
+            <w:pPr>
+              <w:keepNext w:val="0"/>
+              <w:keepLines w:val="0"/>
+              <w:spacing w:before="0" w:after="0" w:line="264" w:lineRule="auto"/>
+            </w:pPr>
+            <w:r>
+              <w:rPr>
+                <w:sz w:val="17"/>
+              </w:rPr>
+              <w:t>Device = Raspberry Pi 4</w:t>
+            </w:r>
+          </w:p>
+        </w:tc>
+        <w:tc>
+          <w:tcPr>
+            <w:tcW w:type="dxa" w:w="2551"/>
+            <w:shd w:val="clear" w:color="auto" w:fill="F5F7FA"/>
+            <w:tcMar>
+              <w:top w:w="55" w:type="dxa"/>
+              <w:left w:w="100" w:type="dxa"/>
+              <w:bottom w:w="55" w:type="dxa"/>
+              <w:right w:w="100" w:type="dxa"/>
+            </w:tcMar>
+            <w:tcBorders>
+              <w:top w:val="nil"/>
+              <w:left w:val="nil"/>
+              <w:bottom w:val="single" w:sz="4" w:space="0" w:color="D9DEE4"/>
+              <w:right w:val="nil"/>
+            </w:tcBorders>
+          </w:tcPr>
+          <w:p>
+            <w:pPr>
+              <w:keepNext w:val="0"/>
+              <w:keepLines w:val="0"/>
+              <w:spacing w:before="0" w:after="0" w:line="264" w:lineRule="auto"/>
+            </w:pPr>
+            <w:r>
+              <w:rPr>
+                <w:sz w:val="17"/>
+              </w:rPr>
+              <w:t>Device = Raspberry Pi 5</w:t>
+            </w:r>
+          </w:p>
+        </w:tc>
+        <w:tc>
+          <w:tcPr>
+            <w:tcW w:type="dxa" w:w="3515"/>
+            <w:shd w:val="clear" w:color="auto" w:fill="F5F7FA"/>
+            <w:tcMar>
+              <w:top w:w="55" w:type="dxa"/>
+              <w:left w:w="100" w:type="dxa"/>
+              <w:bottom w:w="55" w:type="dxa"/>
+              <w:right w:w="100" w:type="dxa"/>
+            </w:tcMar>
+            <w:tcBorders>
+              <w:top w:val="nil"/>
+              <w:left w:val="nil"/>
+              <w:bottom w:val="single" w:sz="4" w:space="0" w:color="D9DEE4"/>
+              <w:right w:val="nil"/>
+            </w:tcBorders>
+          </w:tcPr>
+          <w:p>
+            <w:pPr>
+              <w:keepNext w:val="0"/>
+              <w:keepLines w:val="0"/>
+              <w:spacing w:before="0" w:after="0" w:line="264" w:lineRule="auto"/>
+            </w:pPr>
+            <w:r>
+              <w:rPr>
+                <w:sz w:val="17"/>
+              </w:rPr>
+              <w:t>The only change in the flashing steps.</w:t>
+            </w:r>
+          </w:p>
+        </w:tc>
+      </w:tr>
+      <w:tr>
+        <w:trPr>
+          <w:cantSplit/>
+        </w:trPr>
+        <w:tc>
+          <w:tcPr>
+            <w:tcW w:type="dxa" w:w="1474"/>
+            <w:shd w:val="clear" w:color="auto" w:fill="FFFFFF"/>
+            <w:tcMar>
+              <w:top w:w="55" w:type="dxa"/>
+              <w:left w:w="100" w:type="dxa"/>
+              <w:bottom w:w="55" w:type="dxa"/>
+              <w:right w:w="100" w:type="dxa"/>
+            </w:tcMar>
+            <w:tcBorders>
+              <w:top w:val="nil"/>
+              <w:left w:val="nil"/>
+              <w:bottom w:val="single" w:sz="4" w:space="0" w:color="D9DEE4"/>
+              <w:right w:val="nil"/>
+            </w:tcBorders>
+          </w:tcPr>
+          <w:p>
+            <w:pPr>
+              <w:keepNext w:val="0"/>
+              <w:keepLines w:val="0"/>
+              <w:spacing w:before="0" w:after="0" w:line="264" w:lineRule="auto"/>
+            </w:pPr>
+            <w:r>
+              <w:rPr>
+                <w:sz w:val="17"/>
+              </w:rPr>
+              <w:t>SSH, commands, updates, shutdown</w:t>
+            </w:r>
+          </w:p>
+        </w:tc>
+        <w:tc>
+          <w:tcPr>
+            <w:tcW w:type="dxa" w:w="2211"/>
+            <w:shd w:val="clear" w:color="auto" w:fill="FFFFFF"/>
+            <w:tcMar>
+              <w:top w:w="55" w:type="dxa"/>
+              <w:left w:w="100" w:type="dxa"/>
+              <w:bottom w:w="55" w:type="dxa"/>
+              <w:right w:w="100" w:type="dxa"/>
+            </w:tcMar>
+            <w:tcBorders>
+              <w:top w:val="nil"/>
+              <w:left w:val="nil"/>
+              <w:bottom w:val="single" w:sz="4" w:space="0" w:color="D9DEE4"/>
+              <w:right w:val="nil"/>
+            </w:tcBorders>
+          </w:tcPr>
+          <w:p>
+            <w:pPr>
+              <w:keepNext w:val="0"/>
+              <w:keepLines w:val="0"/>
+              <w:spacing w:before="0" w:after="0" w:line="264" w:lineRule="auto"/>
+            </w:pPr>
+            <w:r>
+              <w:rPr>
+                <w:sz w:val="17"/>
+              </w:rPr>
+              <w:t>same</w:t>
+            </w:r>
+          </w:p>
+        </w:tc>
+        <w:tc>
+          <w:tcPr>
+            <w:tcW w:type="dxa" w:w="2551"/>
+            <w:shd w:val="clear" w:color="auto" w:fill="FFFFFF"/>
+            <w:tcMar>
+              <w:top w:w="55" w:type="dxa"/>
+              <w:left w:w="100" w:type="dxa"/>
+              <w:bottom w:w="55" w:type="dxa"/>
+              <w:right w:w="100" w:type="dxa"/>
+            </w:tcMar>
+            <w:tcBorders>
+              <w:top w:val="nil"/>
+              <w:left w:val="nil"/>
+              <w:bottom w:val="single" w:sz="4" w:space="0" w:color="D9DEE4"/>
+              <w:right w:val="nil"/>
+            </w:tcBorders>
+          </w:tcPr>
+          <w:p>
+            <w:pPr>
+              <w:keepNext w:val="0"/>
+              <w:keepLines w:val="0"/>
+              <w:spacing w:before="0" w:after="0" w:line="264" w:lineRule="auto"/>
+            </w:pPr>
+            <w:r>
+              <w:rPr>
+                <w:sz w:val="17"/>
+              </w:rPr>
+              <w:t>same</w:t>
+            </w:r>
+          </w:p>
+        </w:tc>
+        <w:tc>
+          <w:tcPr>
+            <w:tcW w:type="dxa" w:w="3515"/>
+            <w:shd w:val="clear" w:color="auto" w:fill="FFFFFF"/>
+            <w:tcMar>
+              <w:top w:w="55" w:type="dxa"/>
+              <w:left w:w="100" w:type="dxa"/>
+              <w:bottom w:w="55" w:type="dxa"/>
+              <w:right w:w="100" w:type="dxa"/>
+            </w:tcMar>
+            <w:tcBorders>
+              <w:top w:val="nil"/>
+              <w:left w:val="nil"/>
+              <w:bottom w:val="single" w:sz="4" w:space="0" w:color="D9DEE4"/>
+              <w:right w:val="nil"/>
+            </w:tcBorders>
+          </w:tcPr>
+          <w:p>
+            <w:pPr>
+              <w:keepNext w:val="0"/>
+              <w:keepLines w:val="0"/>
+              <w:spacing w:before="0" w:after="0" w:line="264" w:lineRule="auto"/>
+            </w:pPr>
+            <w:r>
+              <w:rPr>
+                <w:sz w:val="17"/>
+              </w:rPr>
+              <w:t>Identical on both boards.</w:t>
+            </w:r>
+          </w:p>
+        </w:tc>
+      </w:tr>
+    </w:tbl>
+    <w:p>
+      <w:pPr>
+        <w:keepNext w:val="0"/>
+        <w:keepLines w:val="0"/>
+        <w:spacing w:before="0" w:after="0" w:line="100" w:lineRule="exact"/>
+      </w:pPr>
+      <w:r>
+        <w:rPr>
+          <w:sz w:val="10"/>
+        </w:rPr>
+      </w:r>
+    </w:p>
+    <w:p>
+      <w:pPr>
         <w:keepNext w:val="0"/>
         <w:keepLines w:val="0"/>
         <w:spacing w:before="0" w:after="80" w:line="269" w:lineRule="auto"/>
@@ -4637,6 +6307,29 @@
               </w:rPr>
               <w:t>Raspberry Pi 4</w:t>
             </w:r>
+            <w:r>
+              <w:t xml:space="preserve">  (</w:t>
+            </w:r>
+            <w:r>
+              <w:rPr>
+                <w:b/>
+              </w:rPr>
+              <w:t>Pi 5:</w:t>
+            </w:r>
+            <w:r>
+              <w:t xml:space="preserve"> choose </w:t>
+            </w:r>
+            <w:r>
+              <w:rPr>
+                <w:rFonts w:ascii="Courier New" w:hAnsi="Courier New" w:eastAsia="Courier New"/>
+                <w:color w:val="9B1C45"/>
+                <w:sz w:val="19"/>
+              </w:rPr>
+              <w:t>Raspberry Pi 5</w:t>
+            </w:r>
+            <w:r>
+              <w:t xml:space="preserve"> - everything else is identical)</w:t>
+            </w:r>
           </w:p>
           <w:p>
             <w:pPr>
@@ -6791,7 +8484,16 @@
               <w:t>no power button</w:t>
             </w:r>
             <w:r>
-              <w:t xml:space="preserve"> - plugging in turns it on.</w:t>
+              <w:t xml:space="preserve"> - plugging in turns it on. </w:t>
+            </w:r>
+            <w:r>
+              <w:rPr>
+                <w:b/>
+              </w:rPr>
+              <w:t>Pi 5:</w:t>
+            </w:r>
+            <w:r>
+              <w:t xml:space="preserve"> use the 27 W (5 V / 5 A) supply; it has a power button.</w:t>
             </w:r>
           </w:p>
         </w:tc>
@@ -8821,7 +10523,25 @@
               <w:t>green LED stops flashing and stays dark</w:t>
             </w:r>
             <w:r>
-              <w:t>, and only then remove the power (book p. 38).</w:t>
+              <w:t xml:space="preserve">, and only then remove the power (book p. 38). To start a halted </w:t>
+            </w:r>
+            <w:r>
+              <w:rPr>
+                <w:b/>
+              </w:rPr>
+              <w:t>Pi 4</w:t>
+            </w:r>
+            <w:r>
+              <w:t xml:space="preserve"> again, unplug and replug the power; on a </w:t>
+            </w:r>
+            <w:r>
+              <w:rPr>
+                <w:b/>
+              </w:rPr>
+              <w:t>Pi 5</w:t>
+            </w:r>
+            <w:r>
+              <w:t xml:space="preserve"> press the power button.</w:t>
             </w:r>
           </w:p>
         </w:tc>

</xml_diff>